<commit_message>
Refine platform for enterprise expert review
</commit_message>
<xml_diff>
--- a/提交材料/05_企业评审视角优化清单.docx
+++ b/提交材料/05_企业评审视角优化清单.docx
@@ -310,7 +310,7 @@
                 <w:rFonts w:ascii="Calibri" w:hAnsi="Calibri" w:eastAsia="Microsoft YaHei"/>
                 <w:sz w:val="19"/>
               </w:rPr>
-              <w:t>新增 AI 调控师身份卡、主动追问、班前会摘要、飞书卡片和审批草稿</w:t>
+              <w:t>新增调控工作说明、专家审核关注点、班前会摘要、飞书卡片和审批草稿</w:t>
             </w:r>
           </w:p>
         </w:tc>
@@ -527,7 +527,7 @@
         <w:rPr>
           <w:rFonts w:ascii="Calibri" w:hAnsi="Calibri" w:eastAsia="Microsoft YaHei"/>
         </w:rPr>
-        <w:t>拟人化但不娱乐化：平台新增“合成氨 AI 调控师身份卡”，用当班专家口吻主动追问设备、订单、库存和能价，而不是只输出答案。</w:t>
+        <w:t>专家审核友好：页面不再由参赛方自我打分，而是用“调控工作说明”和“专家审核关注点”呈现待确认事项、审批责任和试点条件。</w:t>
       </w:r>
     </w:p>
     <w:p>

</xml_diff>

<commit_message>
Add operational innovation loop
</commit_message>
<xml_diff>
--- a/提交材料/05_企业评审视角优化清单.docx
+++ b/提交材料/05_企业评审视角优化清单.docx
@@ -587,6 +587,356 @@
     </w:p>
     <w:p>
       <w:pPr>
+        <w:pStyle w:val="Heading2"/>
+      </w:pPr>
+      <w:r>
+        <w:t>2.1 页面新增的创新落点闭环</w:t>
+      </w:r>
+    </w:p>
+    <w:tbl>
+      <w:tblPr>
+        <w:tblStyle w:val="TableGrid"/>
+        <w:tblW w:type="auto" w:w="0"/>
+        <w:jc w:val="center"/>
+        <w:tblLayout w:type="fixed"/>
+        <w:tblLook w:firstColumn="1" w:firstRow="1" w:lastColumn="0" w:lastRow="0" w:noHBand="0" w:noVBand="1" w:val="04A0"/>
+      </w:tblPr>
+      <w:tblGrid>
+        <w:gridCol w:w="3216"/>
+        <w:gridCol w:w="3216"/>
+        <w:gridCol w:w="3216"/>
+      </w:tblGrid>
+      <w:tr>
+        <w:tc>
+          <w:tcPr>
+            <w:tcW w:type="dxa" w:w="2160"/>
+            <w:vAlign w:val="center"/>
+            <w:tcMar>
+              <w:top w:w="80" w:type="dxa"/>
+              <w:start w:w="120" w:type="dxa"/>
+              <w:bottom w:w="80" w:type="dxa"/>
+              <w:end w:w="120" w:type="dxa"/>
+            </w:tcMar>
+            <w:shd w:fill="E8EEF5"/>
+          </w:tcPr>
+          <w:p>
+            <w:r>
+              <w:rPr>
+                <w:rFonts w:ascii="Calibri" w:hAnsi="Calibri" w:eastAsia="Microsoft YaHei"/>
+                <w:b/>
+              </w:rPr>
+              <w:t>创新落点</w:t>
+            </w:r>
+          </w:p>
+        </w:tc>
+        <w:tc>
+          <w:tcPr>
+            <w:tcW w:type="dxa" w:w="3600"/>
+            <w:vAlign w:val="center"/>
+            <w:tcMar>
+              <w:top w:w="80" w:type="dxa"/>
+              <w:start w:w="120" w:type="dxa"/>
+              <w:bottom w:w="80" w:type="dxa"/>
+              <w:end w:w="120" w:type="dxa"/>
+            </w:tcMar>
+            <w:shd w:fill="E8EEF5"/>
+          </w:tcPr>
+          <w:p>
+            <w:r>
+              <w:rPr>
+                <w:rFonts w:ascii="Calibri" w:hAnsi="Calibri" w:eastAsia="Microsoft YaHei"/>
+                <w:b/>
+              </w:rPr>
+              <w:t>企业价值</w:t>
+            </w:r>
+          </w:p>
+        </w:tc>
+        <w:tc>
+          <w:tcPr>
+            <w:tcW w:type="dxa" w:w="3600"/>
+            <w:vAlign w:val="center"/>
+            <w:tcMar>
+              <w:top w:w="80" w:type="dxa"/>
+              <w:start w:w="120" w:type="dxa"/>
+              <w:bottom w:w="80" w:type="dxa"/>
+              <w:end w:w="120" w:type="dxa"/>
+            </w:tcMar>
+            <w:shd w:fill="E8EEF5"/>
+          </w:tcPr>
+          <w:p>
+            <w:r>
+              <w:rPr>
+                <w:rFonts w:ascii="Calibri" w:hAnsi="Calibri" w:eastAsia="Microsoft YaHei"/>
+                <w:b/>
+              </w:rPr>
+              <w:t>页面体现</w:t>
+            </w:r>
+          </w:p>
+        </w:tc>
+      </w:tr>
+      <w:tr>
+        <w:tc>
+          <w:tcPr>
+            <w:tcW w:type="dxa" w:w="2160"/>
+            <w:vAlign w:val="center"/>
+            <w:tcMar>
+              <w:top w:w="80" w:type="dxa"/>
+              <w:start w:w="120" w:type="dxa"/>
+              <w:bottom w:w="80" w:type="dxa"/>
+              <w:end w:w="120" w:type="dxa"/>
+            </w:tcMar>
+          </w:tcPr>
+          <w:p>
+            <w:r>
+              <w:rPr>
+                <w:rFonts w:ascii="Calibri" w:hAnsi="Calibri" w:eastAsia="Microsoft YaHei"/>
+                <w:sz w:val="19"/>
+              </w:rPr>
+              <w:t>反事实收益归因</w:t>
+            </w:r>
+          </w:p>
+        </w:tc>
+        <w:tc>
+          <w:tcPr>
+            <w:tcW w:type="dxa" w:w="3600"/>
+            <w:vAlign w:val="center"/>
+            <w:tcMar>
+              <w:top w:w="80" w:type="dxa"/>
+              <w:start w:w="120" w:type="dxa"/>
+              <w:bottom w:w="80" w:type="dxa"/>
+              <w:end w:w="120" w:type="dxa"/>
+            </w:tcMar>
+          </w:tcPr>
+          <w:p>
+            <w:r>
+              <w:rPr>
+                <w:rFonts w:ascii="Calibri" w:hAnsi="Calibri" w:eastAsia="Microsoft YaHei"/>
+                <w:sz w:val="19"/>
+              </w:rPr>
+              <w:t>避免把行情变化或人工经验收益误算为 AI 收益</w:t>
+            </w:r>
+          </w:p>
+        </w:tc>
+        <w:tc>
+          <w:tcPr>
+            <w:tcW w:type="dxa" w:w="3600"/>
+            <w:vAlign w:val="center"/>
+            <w:tcMar>
+              <w:top w:w="80" w:type="dxa"/>
+              <w:start w:w="120" w:type="dxa"/>
+              <w:bottom w:w="80" w:type="dxa"/>
+              <w:end w:w="120" w:type="dxa"/>
+            </w:tcMar>
+          </w:tcPr>
+          <w:p>
+            <w:r>
+              <w:rPr>
+                <w:rFonts w:ascii="Calibri" w:hAnsi="Calibri" w:eastAsia="Microsoft YaHei"/>
+                <w:sz w:val="19"/>
+              </w:rPr>
+              <w:t>同屏保留原计划、AI 建议、采纳结果和实际执行口径</w:t>
+            </w:r>
+          </w:p>
+        </w:tc>
+      </w:tr>
+      <w:tr>
+        <w:tc>
+          <w:tcPr>
+            <w:tcW w:type="dxa" w:w="2160"/>
+            <w:vAlign w:val="center"/>
+            <w:tcMar>
+              <w:top w:w="80" w:type="dxa"/>
+              <w:start w:w="120" w:type="dxa"/>
+              <w:bottom w:w="80" w:type="dxa"/>
+              <w:end w:w="120" w:type="dxa"/>
+            </w:tcMar>
+          </w:tcPr>
+          <w:p>
+            <w:r>
+              <w:rPr>
+                <w:rFonts w:ascii="Calibri" w:hAnsi="Calibri" w:eastAsia="Microsoft YaHei"/>
+                <w:sz w:val="19"/>
+              </w:rPr>
+              <w:t>安全护栏链</w:t>
+            </w:r>
+          </w:p>
+        </w:tc>
+        <w:tc>
+          <w:tcPr>
+            <w:tcW w:type="dxa" w:w="3600"/>
+            <w:vAlign w:val="center"/>
+            <w:tcMar>
+              <w:top w:w="80" w:type="dxa"/>
+              <w:start w:w="120" w:type="dxa"/>
+              <w:bottom w:w="80" w:type="dxa"/>
+              <w:end w:w="120" w:type="dxa"/>
+            </w:tcMar>
+          </w:tcPr>
+          <w:p>
+            <w:r>
+              <w:rPr>
+                <w:rFonts w:ascii="Calibri" w:hAnsi="Calibri" w:eastAsia="Microsoft YaHei"/>
+                <w:sz w:val="19"/>
+              </w:rPr>
+              <w:t>让安环、设备、调度能看到同一套硬约束和审批边界</w:t>
+            </w:r>
+          </w:p>
+        </w:tc>
+        <w:tc>
+          <w:tcPr>
+            <w:tcW w:type="dxa" w:w="3600"/>
+            <w:vAlign w:val="center"/>
+            <w:tcMar>
+              <w:top w:w="80" w:type="dxa"/>
+              <w:start w:w="120" w:type="dxa"/>
+              <w:bottom w:w="80" w:type="dxa"/>
+              <w:end w:w="120" w:type="dxa"/>
+            </w:tcMar>
+          </w:tcPr>
+          <w:p>
+            <w:r>
+              <w:rPr>
+                <w:rFonts w:ascii="Calibri" w:hAnsi="Calibri" w:eastAsia="Microsoft YaHei"/>
+                <w:sz w:val="19"/>
+              </w:rPr>
+              <w:t>工艺约束、风险指数、审批路径、停用条件联动</w:t>
+            </w:r>
+          </w:p>
+        </w:tc>
+      </w:tr>
+      <w:tr>
+        <w:tc>
+          <w:tcPr>
+            <w:tcW w:type="dxa" w:w="2160"/>
+            <w:vAlign w:val="center"/>
+            <w:tcMar>
+              <w:top w:w="80" w:type="dxa"/>
+              <w:start w:w="120" w:type="dxa"/>
+              <w:bottom w:w="80" w:type="dxa"/>
+              <w:end w:w="120" w:type="dxa"/>
+            </w:tcMar>
+          </w:tcPr>
+          <w:p>
+            <w:r>
+              <w:rPr>
+                <w:rFonts w:ascii="Calibri" w:hAnsi="Calibri" w:eastAsia="Microsoft YaHei"/>
+                <w:sz w:val="19"/>
+              </w:rPr>
+              <w:t>未采纳学习</w:t>
+            </w:r>
+          </w:p>
+        </w:tc>
+        <w:tc>
+          <w:tcPr>
+            <w:tcW w:type="dxa" w:w="3600"/>
+            <w:vAlign w:val="center"/>
+            <w:tcMar>
+              <w:top w:w="80" w:type="dxa"/>
+              <w:start w:w="120" w:type="dxa"/>
+              <w:bottom w:w="80" w:type="dxa"/>
+              <w:end w:w="120" w:type="dxa"/>
+            </w:tcMar>
+          </w:tcPr>
+          <w:p>
+            <w:r>
+              <w:rPr>
+                <w:rFonts w:ascii="Calibri" w:hAnsi="Calibri" w:eastAsia="Microsoft YaHei"/>
+                <w:sz w:val="19"/>
+              </w:rPr>
+              <w:t>把专家否决原因变成知识资产，而不是流失在口头沟通中</w:t>
+            </w:r>
+          </w:p>
+        </w:tc>
+        <w:tc>
+          <w:tcPr>
+            <w:tcW w:type="dxa" w:w="3600"/>
+            <w:vAlign w:val="center"/>
+            <w:tcMar>
+              <w:top w:w="80" w:type="dxa"/>
+              <w:start w:w="120" w:type="dxa"/>
+              <w:bottom w:w="80" w:type="dxa"/>
+              <w:end w:w="120" w:type="dxa"/>
+            </w:tcMar>
+          </w:tcPr>
+          <w:p>
+            <w:r>
+              <w:rPr>
+                <w:rFonts w:ascii="Calibri" w:hAnsi="Calibri" w:eastAsia="Microsoft YaHei"/>
+                <w:sz w:val="19"/>
+              </w:rPr>
+              <w:t>未采纳原因标签进入知识库和周度校准</w:t>
+            </w:r>
+          </w:p>
+        </w:tc>
+      </w:tr>
+      <w:tr>
+        <w:tc>
+          <w:tcPr>
+            <w:tcW w:type="dxa" w:w="2160"/>
+            <w:vAlign w:val="center"/>
+            <w:tcMar>
+              <w:top w:w="80" w:type="dxa"/>
+              <w:start w:w="120" w:type="dxa"/>
+              <w:bottom w:w="80" w:type="dxa"/>
+              <w:end w:w="120" w:type="dxa"/>
+            </w:tcMar>
+          </w:tcPr>
+          <w:p>
+            <w:r>
+              <w:rPr>
+                <w:rFonts w:ascii="Calibri" w:hAnsi="Calibri" w:eastAsia="Microsoft YaHei"/>
+                <w:sz w:val="19"/>
+              </w:rPr>
+              <w:t>协同触达</w:t>
+            </w:r>
+          </w:p>
+        </w:tc>
+        <w:tc>
+          <w:tcPr>
+            <w:tcW w:type="dxa" w:w="3600"/>
+            <w:vAlign w:val="center"/>
+            <w:tcMar>
+              <w:top w:w="80" w:type="dxa"/>
+              <w:start w:w="120" w:type="dxa"/>
+              <w:bottom w:w="80" w:type="dxa"/>
+              <w:end w:w="120" w:type="dxa"/>
+            </w:tcMar>
+          </w:tcPr>
+          <w:p>
+            <w:r>
+              <w:rPr>
+                <w:rFonts w:ascii="Calibri" w:hAnsi="Calibri" w:eastAsia="Microsoft YaHei"/>
+                <w:sz w:val="19"/>
+              </w:rPr>
+              <w:t>让调度建议进入企业真实审批和交接流程</w:t>
+            </w:r>
+          </w:p>
+        </w:tc>
+        <w:tc>
+          <w:tcPr>
+            <w:tcW w:type="dxa" w:w="3600"/>
+            <w:vAlign w:val="center"/>
+            <w:tcMar>
+              <w:top w:w="80" w:type="dxa"/>
+              <w:start w:w="120" w:type="dxa"/>
+              <w:bottom w:w="80" w:type="dxa"/>
+              <w:end w:w="120" w:type="dxa"/>
+            </w:tcMar>
+          </w:tcPr>
+          <w:p>
+            <w:r>
+              <w:rPr>
+                <w:rFonts w:ascii="Calibri" w:hAnsi="Calibri" w:eastAsia="Microsoft YaHei"/>
+                <w:sz w:val="19"/>
+              </w:rPr>
+              <w:t>飞书卡片、审批草稿、复盘同步和责任留痕</w:t>
+            </w:r>
+          </w:p>
+        </w:tc>
+      </w:tr>
+    </w:tbl>
+    <w:p>
+      <w:pPr>
         <w:pStyle w:val="Heading1"/>
       </w:pPr>
       <w:r>

</xml_diff>